<commit_message>
feat: add Claude note extraction and audio briefing
</commit_message>
<xml_diff>
--- a/Property_OS_PRD.docx
+++ b/Property_OS_PRD.docx
@@ -227,7 +227,7 @@
     </w:p>
     <w:p>
       <w:pPr>
-        <w:pStyle w:val="Heading3"/>
+        <w:pStyle w:val="Heading2"/>
         <w:keepNext w:val="0"/>
         <w:keepLines w:val="0"/>
         <w:spacing w:after="60" w:before="160" w:line="240" w:lineRule="auto"/>
@@ -3624,6 +3624,50 @@
     </w:p>
     <w:p>
       <w:pPr>
+        <w:pStyle w:val="Heading2"/>
+        <w:keepNext w:val="0"/>
+        <w:keepLines w:val="0"/>
+        <w:spacing w:after="60" w:before="160" w:line="240" w:lineRule="auto"/>
+        <w:rPr>
+          <w:rFonts w:ascii="Calibri" w:cs="Calibri" w:eastAsia="Calibri" w:hAnsi="Calibri"/>
+          <w:color w:val="1a1a1a"/>
+          <w:sz w:val="22"/>
+          <w:szCs w:val="22"/>
+        </w:rPr>
+      </w:pPr>
+      <w:r>
+        <w:rPr>
+          <w:rFonts w:ascii="Calibri" w:cs="Calibri" w:eastAsia="Calibri" w:hAnsi="Calibri"/>
+          <w:color w:val="1a1a1a"/>
+          <w:sz w:val="22"/>
+          <w:szCs w:val="22"/>
+          <w:rtl w:val="0"/>
+        </w:rPr>
+        <w:t>MVP Demo Scenario</w:t>
+      </w:r>
+    </w:p>
+    <w:p>
+      <w:pPr>
+        <w:spacing w:after="80" w:line="240" w:lineRule="auto"/>
+        <w:rPr>
+          <w:rFonts w:ascii="Calibri" w:cs="Calibri" w:eastAsia="Calibri" w:hAnsi="Calibri"/>
+          <w:sz w:val="22"/>
+          <w:szCs w:val="22"/>
+        </w:rPr>
+      </w:pPr>
+      <w:r>
+        <w:rPr>
+          <w:rFonts w:ascii="Calibri" w:cs="Calibri" w:eastAsia="Calibri" w:hAnsi="Calibri"/>
+          <w:color w:val="4a4a4a"/>
+          <w:sz w:val="22"/>
+          <w:szCs w:val="22"/>
+          <w:rtl w:val="0"/>
+        </w:rPr>
+        <w:t>The agent uploads a small real lead file and starts the morning briefing. Property OS says, 'Your first priority is 123 Main Street. The owner asked you to call after Christmas, and that follow-up is now nine days overdue.' The agent verifies the source note, then says, 'Remind me to call next Tuesday.' The system displays the interpreted date for confirmation and updates the property timeline. The demo succeeds when the agent recognizes a useful follow-up they had forgotten.</w:t>
+      </w:r>
+    </w:p>
+    <w:p>
+      <w:pPr>
         <w:pStyle w:val="Heading3"/>
         <w:keepNext w:val="0"/>
         <w:keepLines w:val="0"/>
@@ -3643,27 +3687,207 @@
           <w:szCs w:val="22"/>
           <w:rtl w:val="0"/>
         </w:rPr>
-        <w:t>MVP Demo Scenario</w:t>
-      </w:r>
-    </w:p>
-    <w:p>
-      <w:pPr>
-        <w:spacing w:after="80" w:line="240" w:lineRule="auto"/>
-        <w:rPr>
-          <w:rFonts w:ascii="Calibri" w:cs="Calibri" w:eastAsia="Calibri" w:hAnsi="Calibri"/>
-          <w:sz w:val="22"/>
-          <w:szCs w:val="22"/>
-        </w:rPr>
-      </w:pPr>
-      <w:r>
-        <w:rPr>
-          <w:rFonts w:ascii="Calibri" w:cs="Calibri" w:eastAsia="Calibri" w:hAnsi="Calibri"/>
-          <w:color w:val="4a4a4a"/>
-          <w:sz w:val="22"/>
-          <w:szCs w:val="22"/>
-          <w:rtl w:val="0"/>
-        </w:rPr>
-        <w:t>The agent uploads a small real lead file and starts the morning briefing. Property OS says, 'Your first priority is 123 Main Street. The owner asked you to call after Christmas, and that follow-up is now nine days overdue.' The agent verifies the source note, then says, 'Remind me to call next Tuesday.' The system displays the interpreted date for confirmation and updates the property timeline. The demo succeeds when the agent recognizes a useful follow-up they had forgotten.</w:t>
+        <w:t>Agent Architecture</w:t>
+      </w:r>
+    </w:p>
+    <w:p>
+      <w:pPr>
+        <w:numPr>
+          <w:ilvl w:val="0"/>
+          <w:numId w:val="1"/>
+        </w:numPr>
+        <w:spacing w:after="60" w:line="240" w:lineRule="auto"/>
+        <w:ind w:left="360"/>
+        <w:rPr>
+          <w:rFonts w:ascii="Calibri" w:cs="Calibri" w:eastAsia="Calibri" w:hAnsi="Calibri"/>
+          <w:sz w:val="22"/>
+          <w:szCs w:val="22"/>
+        </w:rPr>
+      </w:pPr>
+      <w:r>
+        <w:rPr>
+          <w:rFonts w:ascii="Calibri" w:cs="Calibri" w:eastAsia="Calibri" w:hAnsi="Calibri"/>
+          <w:color w:val="4a4a4a"/>
+          <w:sz w:val="22"/>
+          <w:szCs w:val="22"/>
+          <w:rtl w:val="0"/>
+        </w:rPr>
+        <w:t xml:space="preserve">Orchestrator Agent (implemented now): TypeScript in the Vinext server controls the CSV-to-extraction-to-validation-to-ranking-to-briefing sequence. It owns state and tool order; the LLM does not write records or send outreach.</w:t>
+      </w:r>
+    </w:p>
+    <w:p>
+      <w:pPr>
+        <w:numPr>
+          <w:ilvl w:val="0"/>
+          <w:numId w:val="1"/>
+        </w:numPr>
+        <w:spacing w:after="60" w:line="240" w:lineRule="auto"/>
+        <w:ind w:left="360"/>
+        <w:rPr>
+          <w:rFonts w:ascii="Calibri" w:cs="Calibri" w:eastAsia="Calibri" w:hAnsi="Calibri"/>
+          <w:sz w:val="22"/>
+          <w:szCs w:val="22"/>
+        </w:rPr>
+      </w:pPr>
+      <w:r>
+        <w:rPr>
+          <w:rFonts w:ascii="Calibri" w:cs="Calibri" w:eastAsia="Calibri" w:hAnsi="Calibri"/>
+          <w:color w:val="4a4a4a"/>
+          <w:sz w:val="22"/>
+          <w:szCs w:val="22"/>
+          <w:rtl w:val="0"/>
+        </w:rPr>
+        <w:t xml:space="preserve">Follow-Up Extraction Agent (implemented now): Anthropic Claude Haiku 4.5, API model claude-haiku-4-5, extracts summary, follow-up request/date, motivation, property signals, do-not-contact status, exact evidence quotes, recommended action, and confidence through JSON-schema structured output.</w:t>
+      </w:r>
+    </w:p>
+    <w:p>
+      <w:pPr>
+        <w:numPr>
+          <w:ilvl w:val="0"/>
+          <w:numId w:val="1"/>
+        </w:numPr>
+        <w:spacing w:after="60" w:line="240" w:lineRule="auto"/>
+        <w:ind w:left="360"/>
+        <w:rPr>
+          <w:rFonts w:ascii="Calibri" w:cs="Calibri" w:eastAsia="Calibri" w:hAnsi="Calibri"/>
+          <w:sz w:val="22"/>
+          <w:szCs w:val="22"/>
+        </w:rPr>
+      </w:pPr>
+      <w:r>
+        <w:rPr>
+          <w:rFonts w:ascii="Calibri" w:cs="Calibri" w:eastAsia="Calibri" w:hAnsi="Calibri"/>
+          <w:color w:val="4a4a4a"/>
+          <w:sz w:val="22"/>
+          <w:szCs w:val="22"/>
+          <w:rtl w:val="0"/>
+        </w:rPr>
+        <w:t xml:space="preserve">Confidence Escalation (optional): Claude Opus 4.8, API model claude-opus-4-8, may reprocess low-confidence rows only. It is disabled by default with ANTHROPIC_ENABLE_OPUS_FALLBACK=false because it costs about five times more than Haiku.</w:t>
+      </w:r>
+    </w:p>
+    <w:p>
+      <w:pPr>
+        <w:numPr>
+          <w:ilvl w:val="0"/>
+          <w:numId w:val="1"/>
+        </w:numPr>
+        <w:spacing w:after="60" w:line="240" w:lineRule="auto"/>
+        <w:ind w:left="360"/>
+        <w:rPr>
+          <w:rFonts w:ascii="Calibri" w:cs="Calibri" w:eastAsia="Calibri" w:hAnsi="Calibri"/>
+          <w:sz w:val="22"/>
+          <w:szCs w:val="22"/>
+        </w:rPr>
+      </w:pPr>
+      <w:r>
+        <w:rPr>
+          <w:rFonts w:ascii="Calibri" w:cs="Calibri" w:eastAsia="Calibri" w:hAnsi="Calibri"/>
+          <w:color w:val="4a4a4a"/>
+          <w:sz w:val="22"/>
+          <w:szCs w:val="22"/>
+          <w:rtl w:val="0"/>
+        </w:rPr>
+        <w:t xml:space="preserve">Property Intelligence and Ranking Agent (implemented now): deterministic TypeScript validates dates and evidence, overrides missed do-not-contact instructions, excludes those records before ranking, and scores only allowed property/workflow signals. External NYC data remains deferred.</w:t>
+      </w:r>
+    </w:p>
+    <w:p>
+      <w:pPr>
+        <w:numPr>
+          <w:ilvl w:val="0"/>
+          <w:numId w:val="1"/>
+        </w:numPr>
+        <w:spacing w:after="60" w:line="240" w:lineRule="auto"/>
+        <w:ind w:left="360"/>
+        <w:rPr>
+          <w:rFonts w:ascii="Calibri" w:cs="Calibri" w:eastAsia="Calibri" w:hAnsi="Calibri"/>
+          <w:sz w:val="22"/>
+          <w:szCs w:val="22"/>
+        </w:rPr>
+      </w:pPr>
+      <w:r>
+        <w:rPr>
+          <w:rFonts w:ascii="Calibri" w:cs="Calibri" w:eastAsia="Calibri" w:hAnsi="Calibri"/>
+          <w:color w:val="4a4a4a"/>
+          <w:sz w:val="22"/>
+          <w:szCs w:val="22"/>
+          <w:rtl w:val="0"/>
+        </w:rPr>
+        <w:t xml:space="preserve">Audio Briefing (implemented now): the browser Web Speech API SpeechSynthesis reads the approved Top 3 briefing aloud, with Play, Pause, Resume, Stop, and the complete on-screen version. It requires no separate TTS key. Speech-to-text/Whisper and automated calling are out of scope for this MVP.</w:t>
+      </w:r>
+    </w:p>
+    <w:p>
+      <w:pPr>
+        <w:numPr>
+          <w:ilvl w:val="0"/>
+          <w:numId w:val="1"/>
+        </w:numPr>
+        <w:spacing w:after="60" w:line="240" w:lineRule="auto"/>
+        <w:ind w:left="360"/>
+        <w:rPr>
+          <w:rFonts w:ascii="Calibri" w:cs="Calibri" w:eastAsia="Calibri" w:hAnsi="Calibri"/>
+          <w:sz w:val="22"/>
+          <w:szCs w:val="22"/>
+        </w:rPr>
+      </w:pPr>
+      <w:r>
+        <w:rPr>
+          <w:rFonts w:ascii="Calibri" w:cs="Calibri" w:eastAsia="Calibri" w:hAnsi="Calibri"/>
+          <w:color w:val="4a4a4a"/>
+          <w:sz w:val="22"/>
+          <w:szCs w:val="22"/>
+          <w:rtl w:val="0"/>
+        </w:rPr>
+        <w:t xml:space="preserve">Outreach and Compliance Agent (future phase only): drafts communication after deterministic permission checks and never sends autonomously. Protected demographic traits, including age, never influence extraction or ranking.</w:t>
+      </w:r>
+    </w:p>
+    <w:p>
+      <w:pPr>
+        <w:numPr>
+          <w:ilvl w:val="0"/>
+          <w:numId w:val="1"/>
+        </w:numPr>
+        <w:spacing w:after="60" w:line="240" w:lineRule="auto"/>
+        <w:ind w:left="360"/>
+        <w:rPr>
+          <w:rFonts w:ascii="Calibri" w:cs="Calibri" w:eastAsia="Calibri" w:hAnsi="Calibri"/>
+          <w:sz w:val="22"/>
+          <w:szCs w:val="22"/>
+        </w:rPr>
+      </w:pPr>
+      <w:r>
+        <w:rPr>
+          <w:rFonts w:ascii="Calibri" w:cs="Calibri" w:eastAsia="Calibri" w:hAnsi="Calibri"/>
+          <w:color w:val="4a4a4a"/>
+          <w:sz w:val="22"/>
+          <w:szCs w:val="22"/>
+          <w:rtl w:val="0"/>
+        </w:rPr>
+        <w:t xml:space="preserve">Cost and latency controls: every run displays provider, elapsed time, token usage, estimated cost, low-confidence review count, and excluded do-not-contact count. The 20-row demo target is under 4 seconds of provider latency and under $0.02 using Haiku; the deterministic fallback keeps the demo usable if the key or provider is unavailable.</w:t>
+      </w:r>
+    </w:p>
+    <w:p>
+      <w:pPr>
+        <w:numPr>
+          <w:ilvl w:val="0"/>
+          <w:numId w:val="1"/>
+        </w:numPr>
+        <w:spacing w:after="60" w:line="240" w:lineRule="auto"/>
+        <w:ind w:left="360"/>
+        <w:rPr>
+          <w:rFonts w:ascii="Calibri" w:cs="Calibri" w:eastAsia="Calibri" w:hAnsi="Calibri"/>
+          <w:sz w:val="22"/>
+          <w:szCs w:val="22"/>
+        </w:rPr>
+      </w:pPr>
+      <w:r>
+        <w:rPr>
+          <w:rFonts w:ascii="Calibri" w:cs="Calibri" w:eastAsia="Calibri" w:hAnsi="Calibri"/>
+          <w:color w:val="4a4a4a"/>
+          <w:sz w:val="22"/>
+          <w:szCs w:val="22"/>
+          <w:rtl w:val="0"/>
+        </w:rPr>
+        <w:t xml:space="preserve">Evaluation plan: public/messy-leads.csv contains 20 typo-heavy, abbreviated, conflicting, relative-date, and do-not-contact notes. Separate human labels in data/messy-leads-expected.json require 100% do-not-contact detection and at least 90% accuracy for dates, motivation, and recommended action before the feature is called demo-ready.</w:t>
       </w:r>
     </w:p>
     <w:p>
@@ -3687,7 +3911,7 @@
           <w:szCs w:val="22"/>
           <w:rtl w:val="0"/>
         </w:rPr>
-        <w:t>Agent Architecture</w:t>
+        <w:t>Constraints and Guardrails</w:t>
       </w:r>
     </w:p>
     <w:p>
@@ -3712,7 +3936,7 @@
           <w:szCs w:val="22"/>
           <w:rtl w:val="0"/>
         </w:rPr>
-        <w:t>Orchestrator Agent: owns the user-facing briefing and coordinates specialist outputs.</w:t>
+        <w:t>Recommendations must show their source evidence. The MVP does not display a percentage seller-probability score.</w:t>
       </w:r>
     </w:p>
     <w:p>
@@ -3737,7 +3961,7 @@
           <w:szCs w:val="22"/>
           <w:rtl w:val="0"/>
         </w:rPr>
-        <w:t>Property Intelligence Agent: assembles evidence-backed property signals; external NYC data is deferred until the imported-data workflow is trusted.</w:t>
+        <w:t>Protected demographic attributes, including age, must not be used in ranking or targeting.</w:t>
       </w:r>
     </w:p>
     <w:p>
@@ -3762,7 +3986,7 @@
           <w:szCs w:val="22"/>
           <w:rtl w:val="0"/>
         </w:rPr>
-        <w:t>Follow-Up Agent: extracts motivation, timing, and next actions from notes and conversation history.</w:t>
+        <w:t>No call, text, email, bulk update, or destructive action occurs without explicit user approval.</w:t>
       </w:r>
     </w:p>
     <w:p>
@@ -3787,156 +4011,7 @@
           <w:szCs w:val="22"/>
           <w:rtl w:val="0"/>
         </w:rPr>
-        <w:t>Outreach and Compliance Agent: future phase only; drafts communication after deterministic permission checks and never sends autonomously.</w:t>
-      </w:r>
-    </w:p>
-    <w:p>
-      <w:pPr>
-        <w:numPr>
-          <w:ilvl w:val="0"/>
-          <w:numId w:val="1"/>
-        </w:numPr>
-        <w:spacing w:after="60" w:line="240" w:lineRule="auto"/>
-        <w:ind w:left="360"/>
-        <w:rPr>
-          <w:rFonts w:ascii="Calibri" w:cs="Calibri" w:eastAsia="Calibri" w:hAnsi="Calibri"/>
-          <w:sz w:val="22"/>
-          <w:szCs w:val="22"/>
-        </w:rPr>
-      </w:pPr>
-      <w:r>
-        <w:rPr>
-          <w:rFonts w:ascii="Calibri" w:cs="Calibri" w:eastAsia="Calibri" w:hAnsi="Calibri"/>
-          <w:color w:val="4a4a4a"/>
-          <w:sz w:val="22"/>
-          <w:szCs w:val="22"/>
-          <w:rtl w:val="0"/>
-        </w:rPr>
-        <w:t>Deterministic application code remains responsible for scoring rules, date confirmation, database writes, permissions, and audit logs.</w:t>
-      </w:r>
-    </w:p>
-    <w:p>
-      <w:pPr>
-        <w:pStyle w:val="Heading3"/>
-        <w:keepNext w:val="0"/>
-        <w:keepLines w:val="0"/>
-        <w:spacing w:after="60" w:before="160" w:line="240" w:lineRule="auto"/>
-        <w:rPr>
-          <w:rFonts w:ascii="Calibri" w:cs="Calibri" w:eastAsia="Calibri" w:hAnsi="Calibri"/>
-          <w:color w:val="1a1a1a"/>
-          <w:sz w:val="22"/>
-          <w:szCs w:val="22"/>
-        </w:rPr>
-      </w:pPr>
-      <w:r>
-        <w:rPr>
-          <w:rFonts w:ascii="Calibri" w:cs="Calibri" w:eastAsia="Calibri" w:hAnsi="Calibri"/>
-          <w:color w:val="1a1a1a"/>
-          <w:sz w:val="22"/>
-          <w:szCs w:val="22"/>
-          <w:rtl w:val="0"/>
-        </w:rPr>
-        <w:t>Constraints and Guardrails</w:t>
-      </w:r>
-    </w:p>
-    <w:p>
-      <w:pPr>
-        <w:numPr>
-          <w:ilvl w:val="0"/>
-          <w:numId w:val="1"/>
-        </w:numPr>
-        <w:spacing w:after="60" w:line="240" w:lineRule="auto"/>
-        <w:ind w:left="360"/>
-        <w:rPr>
-          <w:rFonts w:ascii="Calibri" w:cs="Calibri" w:eastAsia="Calibri" w:hAnsi="Calibri"/>
-          <w:sz w:val="22"/>
-          <w:szCs w:val="22"/>
-        </w:rPr>
-      </w:pPr>
-      <w:r>
-        <w:rPr>
-          <w:rFonts w:ascii="Calibri" w:cs="Calibri" w:eastAsia="Calibri" w:hAnsi="Calibri"/>
-          <w:color w:val="4a4a4a"/>
-          <w:sz w:val="22"/>
-          <w:szCs w:val="22"/>
-          <w:rtl w:val="0"/>
-        </w:rPr>
-        <w:t>Recommendations must show their source evidence. The MVP does not display a percentage seller-probability score.</w:t>
-      </w:r>
-    </w:p>
-    <w:p>
-      <w:pPr>
-        <w:numPr>
-          <w:ilvl w:val="0"/>
-          <w:numId w:val="1"/>
-        </w:numPr>
-        <w:spacing w:after="60" w:line="240" w:lineRule="auto"/>
-        <w:ind w:left="360"/>
-        <w:rPr>
-          <w:rFonts w:ascii="Calibri" w:cs="Calibri" w:eastAsia="Calibri" w:hAnsi="Calibri"/>
-          <w:sz w:val="22"/>
-          <w:szCs w:val="22"/>
-        </w:rPr>
-      </w:pPr>
-      <w:r>
-        <w:rPr>
-          <w:rFonts w:ascii="Calibri" w:cs="Calibri" w:eastAsia="Calibri" w:hAnsi="Calibri"/>
-          <w:color w:val="4a4a4a"/>
-          <w:sz w:val="22"/>
-          <w:szCs w:val="22"/>
-          <w:rtl w:val="0"/>
-        </w:rPr>
-        <w:t>Protected demographic attributes, including age, must not be used in ranking or targeting.</w:t>
-      </w:r>
-    </w:p>
-    <w:p>
-      <w:pPr>
-        <w:numPr>
-          <w:ilvl w:val="0"/>
-          <w:numId w:val="1"/>
-        </w:numPr>
-        <w:spacing w:after="60" w:line="240" w:lineRule="auto"/>
-        <w:ind w:left="360"/>
-        <w:rPr>
-          <w:rFonts w:ascii="Calibri" w:cs="Calibri" w:eastAsia="Calibri" w:hAnsi="Calibri"/>
-          <w:sz w:val="22"/>
-          <w:szCs w:val="22"/>
-        </w:rPr>
-      </w:pPr>
-      <w:r>
-        <w:rPr>
-          <w:rFonts w:ascii="Calibri" w:cs="Calibri" w:eastAsia="Calibri" w:hAnsi="Calibri"/>
-          <w:color w:val="4a4a4a"/>
-          <w:sz w:val="22"/>
-          <w:szCs w:val="22"/>
-          <w:rtl w:val="0"/>
-        </w:rPr>
-        <w:t>No call, text, email, bulk update, or destructive action occurs without explicit user approval.</w:t>
-      </w:r>
-    </w:p>
-    <w:p>
-      <w:pPr>
-        <w:numPr>
-          <w:ilvl w:val="0"/>
-          <w:numId w:val="1"/>
-        </w:numPr>
-        <w:spacing w:after="60" w:line="240" w:lineRule="auto"/>
-        <w:ind w:left="360"/>
-        <w:rPr>
-          <w:rFonts w:ascii="Calibri" w:cs="Calibri" w:eastAsia="Calibri" w:hAnsi="Calibri"/>
-          <w:sz w:val="22"/>
-          <w:szCs w:val="22"/>
-        </w:rPr>
-      </w:pPr>
-      <w:r>
-        <w:rPr>
-          <w:rFonts w:ascii="Calibri" w:cs="Calibri" w:eastAsia="Calibri" w:hAnsi="Calibri"/>
-          <w:color w:val="4a4a4a"/>
-          <w:sz w:val="22"/>
-          <w:szCs w:val="22"/>
-          <w:rtl w:val="0"/>
-        </w:rPr>
-        <w:t>Voice input must always have a visible confirmation and manual fallback.</w:t>
+        <w:t xml:space="preserve">Audio playback must always have visible controls and a complete on-screen fallback; voice input is outside this MVP.</w:t>
       </w:r>
     </w:p>
     <w:p>

</xml_diff>